<commit_message>
fix(ARG-597): mensaje para Joaquín más corto
</commit_message>
<xml_diff>
--- a/documentacion-datos-sensibles/mensaje-para-joaquin.docx
+++ b/documentacion-datos-sensibles/mensaje-para-joaquin.docx
@@ -2,7 +2,7 @@
 <file path=word/document.xml><?xml version="1.0" encoding="utf-8"?>
 <w:document xmlns:w="http://schemas.openxmlformats.org/wordprocessingml/2006/main" xmlns:m="http://schemas.openxmlformats.org/officeDocument/2006/math" xmlns:r="http://schemas.openxmlformats.org/officeDocument/2006/relationships" xmlns:o="urn:schemas-microsoft-com:office:office" xmlns:v="urn:schemas-microsoft-com:vml" xmlns:w10="urn:schemas-microsoft-com:office:word" xmlns:a="http://schemas.openxmlformats.org/drawingml/2006/main" xmlns:pic="http://schemas.openxmlformats.org/drawingml/2006/picture" xmlns:wp="http://schemas.openxmlformats.org/drawingml/2006/wordprocessingDrawing">
   <w:body>
-    <w:bookmarkStart w:id="20" w:name="X32d1882ffc0a55f1f34535d842d6def51775703"/>
+    <w:bookmarkStart w:id="13" w:name="X32d1882ffc0a55f1f34535d842d6def51775703"/>
     <w:p>
       <w:pPr>
         <w:pStyle w:val="Heading1"/>
@@ -16,7 +16,7 @@
         <w:pStyle w:val="BlockText"/>
       </w:pPr>
       <w:r>
-        <w:t xml:space="preserve">Listo para copiar/pegar como email o mensaje. Solo completar el saludo final y los datos de contacto.</w:t>
+        <w:t xml:space="preserve">Listo para copiar/pegar. Completar saludo final y datos de contacto.</w:t>
       </w:r>
     </w:p>
     <w:p>
@@ -41,7 +41,7 @@
         <w:t xml:space="preserve"> </w:t>
       </w:r>
       <w:r>
-        <w:t xml:space="preserve">Consulta legal — Aviso de privacidad y tratamiento por IA de una plataforma de extracción de datos con LLMs</w:t>
+        <w:t xml:space="preserve">Consulta legal — Aviso de privacidad y tratamiento por IA (SAR: extracción de documentos con LLMs) · ARG-597</w:t>
       </w:r>
     </w:p>
     <w:p>
@@ -61,7 +61,7 @@
         <w:pStyle w:val="BodyText"/>
       </w:pPr>
       <w:r>
-        <w:t xml:space="preserve">Te escribo del equipo que está desarrollando</w:t>
+        <w:t xml:space="preserve">Te escribo por una consulta puntual del proyecto</w:t>
       </w:r>
       <w:r>
         <w:t xml:space="preserve"> </w:t>
@@ -74,27 +74,15 @@
         <w:t xml:space="preserve">Multi OCR Tool</w:t>
       </w:r>
       <w:r>
-        <w:t xml:space="preserve"> </w:t>
-      </w:r>
-      <w:r>
-        <w:t xml:space="preserve">(árbol de trabajo ARG-597). Necesitamos tu criterio legal para cerrar un documento que regirá la privacidad del producto, y en paralelo validar con vos algunas preguntas que la investigación por nuestra cuenta no pudo responder con certeza.</w:t>
-      </w:r>
-    </w:p>
-    <w:bookmarkStart w:id="9" w:name="contexto-del-producto"/>
-    <w:p>
-      <w:pPr>
-        <w:pStyle w:val="Heading2"/>
-      </w:pPr>
-      <w:r>
-        <w:t xml:space="preserve">1 · Contexto del producto</w:t>
-      </w:r>
-    </w:p>
-    <w:p>
-      <w:pPr>
-        <w:pStyle w:val="FirstParagraph"/>
-      </w:pPr>
-      <w:r>
-        <w:t xml:space="preserve">Multi OCR Tool es una plataforma que</w:t>
+        <w:t xml:space="preserve">: una plataforma que extrae datos de facturas, remisiones y contratos usando LLMs (hoy ~98% OpenAI, el resto Google Gemini y Mistral; también hay modo local). El contenido del documento se envía al proveedor según la cuenta configurada, y el modelo final todavía no está decidido.</w:t>
+      </w:r>
+    </w:p>
+    <w:p>
+      <w:pPr>
+        <w:pStyle w:val="BodyText"/>
+      </w:pPr>
+      <w:r>
+        <w:t xml:space="preserve">Antes de escribirte ya investigamos y documentamos con fuentes: la clasificación legal de estos documentos bajo la Ley 25.326 (facturas/contratos = datos intermedios, no sensibles por regla general), qué retiene/entrena cada proveedor, el régimen de transferencia internacional (art. 12) y el contenido mínimo de un aviso (art. 6). Con eso redactamos el</w:t>
       </w:r>
       <w:r>
         <w:t xml:space="preserve"> </w:t>
@@ -104,13 +92,13 @@
           <w:b/>
           <w:bCs/>
         </w:rPr>
-        <w:t xml:space="preserve">extrae datos de documentos</w:t>
+        <w:t xml:space="preserve">Aviso de Privacidad v0.1</w:t>
       </w:r>
       <w:r>
         <w:t xml:space="preserve"> </w:t>
       </w:r>
       <w:r>
-        <w:t xml:space="preserve">(facturas, remisiones, contratos y comprobantes afines) mediante</w:t>
+        <w:t xml:space="preserve">adjunto, que</w:t>
       </w:r>
       <w:r>
         <w:t xml:space="preserve"> </w:t>
@@ -120,34 +108,43 @@
           <w:b/>
           <w:bCs/>
         </w:rPr>
-        <w:t xml:space="preserve">modelos de lenguaje de gran tamaño (LLM)</w:t>
-      </w:r>
-      <w:r>
-        <w:t xml:space="preserve">. Para funcionar, el contenido de cada documento se envía a un proveedor externo (OpenAI, Google o Mistral, según la cuenta configurada) o se procesa con un modelo local (ej. Paligemma/Ollama), y el resultado de extracción se devuelve al usuario.</w:t>
-      </w:r>
-    </w:p>
-    <w:p>
-      <w:pPr>
-        <w:pStyle w:val="BodyText"/>
-      </w:pPr>
-      <w:r>
-        <w:t xml:space="preserve">El uso real en producción es:</w:t>
-      </w:r>
-      <w:r>
-        <w:t xml:space="preserve"> </w:t>
-      </w:r>
+        <w:t xml:space="preserve">no te pedimos redactar sino validar</w:t>
+      </w:r>
+      <w:r>
+        <w:t xml:space="preserve">.</w:t>
+      </w:r>
+    </w:p>
+    <w:bookmarkStart w:id="9" w:name="X4c89d3fc8aad2ddd050b20aa34e3cb184668c23"/>
+    <w:p>
+      <w:pPr>
+        <w:pStyle w:val="Heading2"/>
+      </w:pPr>
+      <w:r>
+        <w:t xml:space="preserve">Preguntas (lo que no pudimos responder por nuestra cuenta)</w:t>
+      </w:r>
+    </w:p>
+    <w:p>
+      <w:pPr>
+        <w:pStyle w:val="FirstParagraph"/>
+      </w:pPr>
       <w:r>
         <w:rPr>
           <w:b/>
           <w:bCs/>
         </w:rPr>
-        <w:t xml:space="preserve">~98% OpenAI (gpt-5-mini), ~1,6% Google Gemini, menos de 1% Mistral y modelo local.</w:t>
+        <w:t xml:space="preserve">1 · Consentimiento para datos de terceros.</w:t>
       </w:r>
       <w:r>
         <w:t xml:space="preserve"> </w:t>
       </w:r>
       <w:r>
-        <w:t xml:space="preserve">Todavía no está cerrada la decisión de qué modelo(s) se usarán en definitiva — por eso las preguntas te las organizo generales (por categoría de modelo) y específicas (por proveedor).</w:t>
+        <w:t xml:space="preserve">El documento puede ser de un tercero (ej. factura de un proveedor del cliente). Encontramos como posible excepción el art. 5º inc. d (</w:t>
+      </w:r>
+      <w:r>
+        <w:t xml:space="preserve">“datos derivados de relación contractual”</w:t>
+      </w:r>
+      <w:r>
+        <w:t xml:space="preserve">). ¿Basta el consentimiento del usuario que sube, con cláusula de responsabilidad en el aviso, o la plataforma debe exigir base legal por los datos de terceros? ¿Es sólida la excepción del inc. d acá?</w:t>
       </w:r>
     </w:p>
     <w:p>
@@ -155,25 +152,81 @@
         <w:pStyle w:val="BodyText"/>
       </w:pPr>
       <w:r>
-        <w:t xml:space="preserve">El producto se ofrece a empresas que procesan documentación comercial propia y de sus clientes/proveedores.</w:t>
+        <w:rPr>
+          <w:b/>
+          <w:bCs/>
+        </w:rPr>
+        <w:t xml:space="preserve">2 · Valor legal de los ToS de los proveedores.</w:t>
+      </w:r>
+      <w:r>
+        <w:t xml:space="preserve"> </w:t>
+      </w:r>
+      <w:r>
+        <w:t xml:space="preserve">¿Los términos de servicio de OpenAI/Google/Mistral alcanzan como fundamento contractual, o es imprescindible un DPA firmado con cada uno (art. 25, Ley 25.326)? ¿Qué espera la AAIP en práctica?</w:t>
+      </w:r>
+    </w:p>
+    <w:p>
+      <w:pPr>
+        <w:pStyle w:val="BodyText"/>
+      </w:pPr>
+      <w:r>
+        <w:rPr>
+          <w:b/>
+          <w:bCs/>
+        </w:rPr>
+        <w:t xml:space="preserve">3 · Usuario consumidor (Ley 24.240).</w:t>
+      </w:r>
+      <w:r>
+        <w:t xml:space="preserve"> </w:t>
+      </w:r>
+      <w:r>
+        <w:t xml:space="preserve">Si el usuario es consumidor y no empresa, ¿cambia la base legal? ¿El aviso debe presentarse destacado/inequívoco o alcanza la aceptación estándar?</w:t>
+      </w:r>
+    </w:p>
+    <w:p>
+      <w:pPr>
+        <w:pStyle w:val="BodyText"/>
+      </w:pPr>
+      <w:r>
+        <w:rPr>
+          <w:b/>
+          <w:bCs/>
+        </w:rPr>
+        <w:t xml:space="preserve">4 · Validación del Aviso v0.1 (adjunto).</w:t>
+      </w:r>
+      <w:r>
+        <w:t xml:space="preserve"> </w:t>
+      </w:r>
+      <w:r>
+        <w:t xml:space="preserve">¿Cumple el art. 6? ¿Alguna afirmación de la tabla de retención por proveedor debería matizarse para no comprometernos de más? ¿Falta alguna cláusula estándar de mercado?</w:t>
+      </w:r>
+    </w:p>
+    <w:p>
+      <w:pPr>
+        <w:pStyle w:val="BodyText"/>
+      </w:pPr>
+      <w:r>
+        <w:rPr>
+          <w:b/>
+          <w:bCs/>
+        </w:rPr>
+        <w:t xml:space="preserve">5 · Estrategia internacional.</w:t>
+      </w:r>
+      <w:r>
+        <w:t xml:space="preserve"> </w:t>
+      </w:r>
+      <w:r>
+        <w:t xml:space="preserve">Si el producto sale de Argentina: ¿aviso genérico o versiones por jurisdicción? ¿Diseñarlo multi-jurisdicción desde el inicio o adaptar al expandir?</w:t>
       </w:r>
     </w:p>
     <w:bookmarkEnd w:id="9"/>
-    <w:bookmarkStart w:id="10" w:name="Xec22f97ef91e8f5f2f2d3f73cc386ff54e2693f"/>
+    <w:bookmarkStart w:id="10" w:name="X34eeaad628baa2f3239d2981348241a96850135"/>
     <w:p>
       <w:pPr>
         <w:pStyle w:val="Heading2"/>
       </w:pPr>
       <w:r>
-        <w:t xml:space="preserve">2 · Qué ya investigamos por nuestra cuenta (para que no partamos de cero)</w:t>
-      </w:r>
-    </w:p>
-    <w:p>
-      <w:pPr>
-        <w:pStyle w:val="FirstParagraph"/>
-      </w:pPr>
-      <w:r>
-        <w:t xml:space="preserve">Antes de escribirte hicimos una revisión con fuentes sobre:</w:t>
+        <w:t xml:space="preserve">Decisiones de producto abiertas (condicionan las respuestas)</w:t>
       </w:r>
     </w:p>
     <w:p>
@@ -185,61 +238,16 @@
         </w:numPr>
       </w:pPr>
       <w:r>
-        <w:rPr>
-          <w:b/>
-          <w:bCs/>
-        </w:rPr>
-        <w:t xml:space="preserve">Naturaleza legal de los documentos.</w:t>
+        <w:t xml:space="preserve">¿Modelo local por defecto o solo</w:t>
       </w:r>
       <w:r>
         <w:t xml:space="preserve"> </w:t>
       </w:r>
       <w:r>
-        <w:t xml:space="preserve">Según doctrina que cita la Ley 25.326 y criterios de la AAIP, las facturas, remitos y contratos contienen</w:t>
-      </w:r>
-      <w:r>
-        <w:t xml:space="preserve"> </w:t>
-      </w:r>
-      <w:r>
-        <w:rPr>
-          <w:b/>
-          <w:bCs/>
-        </w:rPr>
-        <w:t xml:space="preserve">datos personales de carácter</w:t>
-      </w:r>
-      <w:r>
-        <w:rPr>
-          <w:b/>
-          <w:bCs/>
-        </w:rPr>
-        <w:t xml:space="preserve"> </w:t>
-      </w:r>
-      <w:r>
-        <w:rPr>
-          <w:b/>
-          <w:bCs/>
-        </w:rPr>
-        <w:t xml:space="preserve">“intermedio”</w:t>
-      </w:r>
-      <w:r>
-        <w:rPr>
-          <w:b/>
-          <w:bCs/>
-        </w:rPr>
-        <w:t xml:space="preserve"> </w:t>
-      </w:r>
-      <w:r>
-        <w:rPr>
-          <w:b/>
-          <w:bCs/>
-        </w:rPr>
-        <w:t xml:space="preserve">y, por regla general, NO sensibles</w:t>
-      </w:r>
-      <w:r>
-        <w:t xml:space="preserve"> </w:t>
-      </w:r>
-      <w:r>
-        <w:t xml:space="preserve">(sensibles son los de origen racial/étnico, ideas políticas, convicciones religiosas, afiliación sindical, salud y vida sexual, según el art. 2º).</w:t>
+        <w:t xml:space="preserve">“avanzado”</w:t>
+      </w:r>
+      <w:r>
+        <w:t xml:space="preserve">?</w:t>
       </w:r>
     </w:p>
     <w:p>
@@ -251,17 +259,7 @@
         </w:numPr>
       </w:pPr>
       <w:r>
-        <w:rPr>
-          <w:b/>
-          <w:bCs/>
-        </w:rPr>
-        <w:t xml:space="preserve">Retención y entrenamiento de cada proveedor:</w:t>
-      </w:r>
-      <w:r>
-        <w:t xml:space="preserve"> </w:t>
-      </w:r>
-      <w:r>
-        <w:t xml:space="preserve">OpenAI no entrena con la API y retiene logs hasta 30 días; Google no usa los datos para entrenar cuando hay cuenta pagada; Mistral no entrena por defecto; el modelo local no envía nada a terceros (salvo detalles de telemetría que se pueden desactivar).</w:t>
+        <w:t xml:space="preserve">¿Usuario con su propia API key (BYOK) eligiendo proveedor? (define quién es responsable frente al titular de los datos)</w:t>
       </w:r>
     </w:p>
     <w:p>
@@ -273,512 +271,17 @@
         </w:numPr>
       </w:pPr>
       <w:r>
-        <w:rPr>
-          <w:b/>
-          <w:bCs/>
-        </w:rPr>
-        <w:t xml:space="preserve">Transferencia internacional:</w:t>
-      </w:r>
-      <w:r>
-        <w:t xml:space="preserve"> </w:t>
-      </w:r>
-      <w:r>
-        <w:t xml:space="preserve">enviar documentos a una API en EE.UU. configura una transferencia internacional (art. 12, Ley 25.326) y EE.UU. no está en la lista de países con nivel adecuado → requiere cláusulas contractuales modelo o consentimiento expreso.</w:t>
-      </w:r>
-    </w:p>
-    <w:p>
-      <w:pPr>
-        <w:pStyle w:val="Compact"/>
-        <w:numPr>
-          <w:ilvl w:val="0"/>
-          <w:numId w:val="1001"/>
-        </w:numPr>
-      </w:pPr>
-      <w:r>
-        <w:rPr>
-          <w:b/>
-          <w:bCs/>
-        </w:rPr>
-        <w:t xml:space="preserve">Contenido mínimo de un aviso</w:t>
-      </w:r>
-      <w:r>
-        <w:t xml:space="preserve"> </w:t>
-      </w:r>
-      <w:r>
-        <w:t xml:space="preserve">según el art. 6 de la Ley 25.326 (finalidad, destinatarios, responsable, carácter de las respuestas, derechos ARCO).</w:t>
-      </w:r>
-    </w:p>
-    <w:p>
-      <w:pPr>
-        <w:pStyle w:val="Compact"/>
-        <w:numPr>
-          <w:ilvl w:val="0"/>
-          <w:numId w:val="1001"/>
-        </w:numPr>
-      </w:pPr>
-      <w:r>
-        <w:rPr>
-          <w:b/>
-          <w:bCs/>
-        </w:rPr>
-        <w:t xml:space="preserve">Precedentes reales</w:t>
-      </w:r>
-      <w:r>
-        <w:t xml:space="preserve"> </w:t>
-      </w:r>
-      <w:r>
-        <w:t xml:space="preserve">que usamos como modelo de redacción: Nino Legal (AR, DPA por proveedor con cláusulas AAIP), ContratoAlquiler (ES, página de transparencia IA + anonimización previa), Docusign y Thomson Reuters (cláusulas de entrenamiento y revisión humana).</w:t>
-      </w:r>
-    </w:p>
-    <w:p>
-      <w:pPr>
-        <w:pStyle w:val="FirstParagraph"/>
-      </w:pPr>
-      <w:r>
-        <w:t xml:space="preserve">Con eso redactamos el</w:t>
-      </w:r>
-      <w:r>
-        <w:t xml:space="preserve"> </w:t>
-      </w:r>
-      <w:r>
-        <w:rPr>
-          <w:b/>
-          <w:bCs/>
-        </w:rPr>
-        <w:t xml:space="preserve">Aviso de Privacidad y Tratamiento por IA v0.1</w:t>
-      </w:r>
-      <w:r>
-        <w:t xml:space="preserve"> </w:t>
-      </w:r>
-      <w:r>
-        <w:t xml:space="preserve">que te adjunto (PDF + Word).</w:t>
-      </w:r>
-      <w:r>
-        <w:t xml:space="preserve"> </w:t>
-      </w:r>
-      <w:r>
-        <w:rPr>
-          <w:b/>
-          <w:bCs/>
-        </w:rPr>
-        <w:t xml:space="preserve">No pedimos que lo redactes desde cero: pedimos que lo valides.</w:t>
+        <w:t xml:space="preserve">Datos sensibles: ¿bloquear la subida por defecto o solo advertir?</w:t>
       </w:r>
     </w:p>
     <w:bookmarkEnd w:id="10"/>
-    <w:bookmarkStart w:id="16" w:name="X2ead49ebd1e084f610ce3e207859d53d3b7eca7"/>
+    <w:bookmarkStart w:id="11" w:name="qué-esperamos-de-vos"/>
     <w:p>
       <w:pPr>
         <w:pStyle w:val="Heading2"/>
       </w:pPr>
       <w:r>
-        <w:t xml:space="preserve">3 · Preguntas que necesitamos que respondas (lo que NO pudimos responder por nuestra cuenta)</w:t>
-      </w:r>
-    </w:p>
-    <w:bookmarkStart w:id="11" w:name="p1-consentimiento-para-datos-de-terceros"/>
-    <w:p>
-      <w:pPr>
-        <w:pStyle w:val="Heading3"/>
-      </w:pPr>
-      <w:r>
-        <w:t xml:space="preserve">P1 · Consentimiento para datos de terceros</w:t>
-      </w:r>
-    </w:p>
-    <w:p>
-      <w:pPr>
-        <w:pStyle w:val="FirstParagraph"/>
-      </w:pPr>
-      <w:r>
-        <w:rPr>
-          <w:b/>
-          <w:bCs/>
-        </w:rPr>
-        <w:t xml:space="preserve">Contexto:</w:t>
-      </w:r>
-      <w:r>
-        <w:t xml:space="preserve"> </w:t>
-      </w:r>
-      <w:r>
-        <w:t xml:space="preserve">los documentos que se procesan suelen pertenecer a un</w:t>
-      </w:r>
-      <w:r>
-        <w:t xml:space="preserve"> </w:t>
-      </w:r>
-      <w:r>
-        <w:rPr>
-          <w:b/>
-          <w:bCs/>
-        </w:rPr>
-        <w:t xml:space="preserve">tercero</w:t>
-      </w:r>
-      <w:r>
-        <w:t xml:space="preserve"> </w:t>
-      </w:r>
-      <w:r>
-        <w:t xml:space="preserve">(por ejemplo, una factura que un cliente le pasa a su proveedor, o un contrato firmado por otra parte). La Ley 25.326 exige consentimiento del</w:t>
-      </w:r>
-      <w:r>
-        <w:t xml:space="preserve"> </w:t>
-      </w:r>
-      <w:r>
-        <w:rPr>
-          <w:b/>
-          <w:bCs/>
-        </w:rPr>
-        <w:t xml:space="preserve">titular</w:t>
-      </w:r>
-      <w:r>
-        <w:t xml:space="preserve"> </w:t>
-      </w:r>
-      <w:r>
-        <w:t xml:space="preserve">de los datos (art. 5º).</w:t>
-      </w:r>
-      <w:r>
-        <w:t xml:space="preserve"> </w:t>
-      </w:r>
-      <w:r>
-        <w:rPr>
-          <w:b/>
-          <w:bCs/>
-        </w:rPr>
-        <w:t xml:space="preserve">Lo que encontramos:</w:t>
-      </w:r>
-      <w:r>
-        <w:t xml:space="preserve"> </w:t>
-      </w:r>
-      <w:r>
-        <w:t xml:space="preserve">el art. 5º, inc. d, exime de consentimiento a los datos que</w:t>
-      </w:r>
-      <w:r>
-        <w:t xml:space="preserve"> </w:t>
-      </w:r>
-      <w:r>
-        <w:t xml:space="preserve">“deriven de una relación contractual y resulten necesarios para su desarrollo o cumplimiento”</w:t>
-      </w:r>
-      <w:r>
-        <w:t xml:space="preserve">; y el inc. c, para listados con nombre/identificación tributaria. Un precedente de la competencia (Nino Legal) pone como regla que</w:t>
-      </w:r>
-      <w:r>
-        <w:t xml:space="preserve"> </w:t>
-      </w:r>
-      <w:r>
-        <w:rPr>
-          <w:b/>
-          <w:bCs/>
-        </w:rPr>
-        <w:t xml:space="preserve">“el usuario debe contar con base legal o consentimiento para cargar datos de terceros”</w:t>
-      </w:r>
-      <w:r>
-        <w:t xml:space="preserve">.</w:t>
-      </w:r>
-      <w:r>
-        <w:t xml:space="preserve"> </w:t>
-      </w:r>
-      <w:r>
-        <w:rPr>
-          <w:b/>
-          <w:bCs/>
-        </w:rPr>
-        <w:t xml:space="preserve">Lo que necesitamos de vos:</w:t>
-      </w:r>
-      <w:r>
-        <w:t xml:space="preserve"> </w:t>
-      </w:r>
-      <w:r>
-        <w:t xml:space="preserve">¿basta con el consentimiento del usuario que sube el documento (más la cláusula de responsabilidad del usuario en el aviso), o la plataforma debe exigir/verificar la base legal para los datos de terceros? ¿Es sólida la excepción del inc. d para el caso de facturas de proveedores, o conviene apoyarse también en el consentimiento del usuario?</w:t>
-      </w:r>
-    </w:p>
-    <w:bookmarkEnd w:id="11"/>
-    <w:bookmarkStart w:id="12" w:name="X00c2af522f7380071ee4ca90c5a55c89ef53a7d"/>
-    <w:p>
-      <w:pPr>
-        <w:pStyle w:val="Heading3"/>
-      </w:pPr>
-      <w:r>
-        <w:t xml:space="preserve">P2 · Valor legal de los términos de servicio (ToS) de los proveedores</w:t>
-      </w:r>
-    </w:p>
-    <w:p>
-      <w:pPr>
-        <w:pStyle w:val="FirstParagraph"/>
-      </w:pPr>
-      <w:r>
-        <w:rPr>
-          <w:b/>
-          <w:bCs/>
-        </w:rPr>
-        <w:t xml:space="preserve">Contexto:</w:t>
-      </w:r>
-      <w:r>
-        <w:t xml:space="preserve"> </w:t>
-      </w:r>
-      <w:r>
-        <w:t xml:space="preserve">los acuerdos de procesamiento que tenemos son los</w:t>
-      </w:r>
-      <w:r>
-        <w:t xml:space="preserve"> </w:t>
-      </w:r>
-      <w:r>
-        <w:rPr>
-          <w:b/>
-          <w:bCs/>
-        </w:rPr>
-        <w:t xml:space="preserve">términos de servicio generales</w:t>
-      </w:r>
-      <w:r>
-        <w:t xml:space="preserve"> </w:t>
-      </w:r>
-      <w:r>
-        <w:t xml:space="preserve">de OpenAI, Google y Mistral (más sus DPA públicos cuando existen).</w:t>
-      </w:r>
-      <w:r>
-        <w:t xml:space="preserve"> </w:t>
-      </w:r>
-      <w:r>
-        <w:rPr>
-          <w:b/>
-          <w:bCs/>
-        </w:rPr>
-        <w:t xml:space="preserve">Lo que encontramos:</w:t>
-      </w:r>
-      <w:r>
-        <w:t xml:space="preserve"> </w:t>
-      </w:r>
-      <w:r>
-        <w:t xml:space="preserve">el art. 25 de la Ley 25.326 exige un</w:t>
-      </w:r>
-      <w:r>
-        <w:t xml:space="preserve"> </w:t>
-      </w:r>
-      <w:r>
-        <w:rPr>
-          <w:b/>
-          <w:bCs/>
-        </w:rPr>
-        <w:t xml:space="preserve">contrato de prestación de servicios</w:t>
-      </w:r>
-      <w:r>
-        <w:t xml:space="preserve"> </w:t>
-      </w:r>
-      <w:r>
-        <w:t xml:space="preserve">cuando se encarga a un tercero el tratamiento de datos personales, con condiciones de seguridad mínimas y finalidad delimitada.</w:t>
-      </w:r>
-      <w:r>
-        <w:t xml:space="preserve"> </w:t>
-      </w:r>
-      <w:r>
-        <w:rPr>
-          <w:b/>
-          <w:bCs/>
-        </w:rPr>
-        <w:t xml:space="preserve">Lo que necesitamos de vos:</w:t>
-      </w:r>
-      <w:r>
-        <w:t xml:space="preserve"> </w:t>
-      </w:r>
-      <w:r>
-        <w:t xml:space="preserve">¿los ToS de los proveedores alcanzan como fundamento contractual del tratamiento, o es imprescindible firmar un DPA con cada uno (como hace Nino Legal, con cláusulas modelo AAIP Res. 198/2023)? ¿Qué nivel de detalle espera la AAIP en la práctica para una plataforma que envía documentos a LLMs?</w:t>
-      </w:r>
-    </w:p>
-    <w:bookmarkEnd w:id="12"/>
-    <w:bookmarkStart w:id="13" w:name="p3-usuario-consumidor-ley-24.240"/>
-    <w:p>
-      <w:pPr>
-        <w:pStyle w:val="Heading3"/>
-      </w:pPr>
-      <w:r>
-        <w:t xml:space="preserve">P3 · Usuario consumidor (Ley 24.240)</w:t>
-      </w:r>
-    </w:p>
-    <w:p>
-      <w:pPr>
-        <w:pStyle w:val="FirstParagraph"/>
-      </w:pPr>
-      <w:r>
-        <w:rPr>
-          <w:b/>
-          <w:bCs/>
-        </w:rPr>
-        <w:t xml:space="preserve">Contexto:</w:t>
-      </w:r>
-      <w:r>
-        <w:t xml:space="preserve"> </w:t>
-      </w:r>
-      <w:r>
-        <w:t xml:space="preserve">el producto puede usarse tanto por empresas (usuarios profesionales) como por personas que contratan servicios de extracción (potencialmente consumidores).</w:t>
-      </w:r>
-      <w:r>
-        <w:t xml:space="preserve"> </w:t>
-      </w:r>
-      <w:r>
-        <w:rPr>
-          <w:b/>
-          <w:bCs/>
-        </w:rPr>
-        <w:t xml:space="preserve">Lo que encontramos:</w:t>
-      </w:r>
-      <w:r>
-        <w:t xml:space="preserve"> </w:t>
-      </w:r>
-      <w:r>
-        <w:t xml:space="preserve">el art. 5º de la Ley 25.326 regula el consentimiento libre, expreso e informado; pero no verificamos cómo se combina con el régimen de la Ley 24.240 cuando el usuario es consumidor final (cláusulas abusivas, información</w:t>
-      </w:r>
-      <w:r>
-        <w:t xml:space="preserve"> </w:t>
-      </w:r>
-      <w:r>
-        <w:t xml:space="preserve">“destacada”</w:t>
-      </w:r>
-      <w:r>
-        <w:t xml:space="preserve">, etc.).</w:t>
-      </w:r>
-      <w:r>
-        <w:t xml:space="preserve"> </w:t>
-      </w:r>
-      <w:r>
-        <w:rPr>
-          <w:b/>
-          <w:bCs/>
-        </w:rPr>
-        <w:t xml:space="preserve">Lo que necesitamos de vos:</w:t>
-      </w:r>
-      <w:r>
-        <w:t xml:space="preserve"> </w:t>
-      </w:r>
-      <w:r>
-        <w:t xml:space="preserve">¿cambia la base legal cuando el usuario es consumidor? ¿El aviso debe presentarse de forma especialmente destacada/inequívoca, o alcanza con la aceptación estándar (click/checkbox)? ¿Conviene una regla distinta en el aviso para consumidores vs profesionales?</w:t>
-      </w:r>
-    </w:p>
-    <w:bookmarkEnd w:id="13"/>
-    <w:bookmarkStart w:id="14" w:name="Xbf4cffe1ba9925fecf7975205fbb9446c0f657e"/>
-    <w:p>
-      <w:pPr>
-        <w:pStyle w:val="Heading3"/>
-      </w:pPr>
-      <w:r>
-        <w:t xml:space="preserve">P4 · Validación de la redacción del Aviso v0.1 (adjunto)</w:t>
-      </w:r>
-    </w:p>
-    <w:p>
-      <w:pPr>
-        <w:pStyle w:val="FirstParagraph"/>
-      </w:pPr>
-      <w:r>
-        <w:rPr>
-          <w:b/>
-          <w:bCs/>
-        </w:rPr>
-        <w:t xml:space="preserve">Contexto:</w:t>
-      </w:r>
-      <w:r>
-        <w:t xml:space="preserve"> </w:t>
-      </w:r>
-      <w:r>
-        <w:t xml:space="preserve">te adjuntamos el aviso oficial para que lo revises sección por sección.</w:t>
-      </w:r>
-      <w:r>
-        <w:t xml:space="preserve"> </w:t>
-      </w:r>
-      <w:r>
-        <w:rPr>
-          <w:b/>
-          <w:bCs/>
-        </w:rPr>
-        <w:t xml:space="preserve">Lo que necesitamos de vos:</w:t>
-      </w:r>
-      <w:r>
-        <w:t xml:space="preserve"> </w:t>
-      </w:r>
-      <w:r>
-        <w:t xml:space="preserve">- ¿Cumple el contenido mínimo del art. 6 de la Ley 25.326?</w:t>
-      </w:r>
-      <w:r>
-        <w:t xml:space="preserve"> </w:t>
-      </w:r>
-      <w:r>
-        <w:t xml:space="preserve">- ¿La tabla de retención por proveedor y las afirmaciones sobre entrenamiento están correctamente planteadas, o alguna afirmación debería matizarse para no crear un compromiso que no podamos sostener?</w:t>
-      </w:r>
-      <w:r>
-        <w:t xml:space="preserve"> </w:t>
-      </w:r>
-      <w:r>
-        <w:t xml:space="preserve">- ¿La sección de datos sensibles (regla general: no cargar; excepción: consentimiento explícito) es correcta y suficiente?</w:t>
-      </w:r>
-      <w:r>
-        <w:t xml:space="preserve"> </w:t>
-      </w:r>
-      <w:r>
-        <w:t xml:space="preserve">- ¿Falta alguna cláusula estándar del mercado que esperarías ver en un aviso de este tipo?</w:t>
-      </w:r>
-    </w:p>
-    <w:bookmarkEnd w:id="14"/>
-    <w:bookmarkStart w:id="15" w:name="p5-estrategia-internacional"/>
-    <w:p>
-      <w:pPr>
-        <w:pStyle w:val="Heading3"/>
-      </w:pPr>
-      <w:r>
-        <w:t xml:space="preserve">P5 · Estrategia internacional</w:t>
-      </w:r>
-    </w:p>
-    <w:p>
-      <w:pPr>
-        <w:pStyle w:val="FirstParagraph"/>
-      </w:pPr>
-      <w:r>
-        <w:rPr>
-          <w:b/>
-          <w:bCs/>
-        </w:rPr>
-        <w:t xml:space="preserve">Contexto:</w:t>
-      </w:r>
-      <w:r>
-        <w:t xml:space="preserve"> </w:t>
-      </w:r>
-      <w:r>
-        <w:t xml:space="preserve">no descartamos que el producto salga a otros mercados (España/Latam, y potencialmente Europa por las reglas de protección de datos).</w:t>
-      </w:r>
-      <w:r>
-        <w:t xml:space="preserve"> </w:t>
-      </w:r>
-      <w:r>
-        <w:rPr>
-          <w:b/>
-          <w:bCs/>
-        </w:rPr>
-        <w:t xml:space="preserve">Lo que encontramos:</w:t>
-      </w:r>
-      <w:r>
-        <w:t xml:space="preserve"> </w:t>
-      </w:r>
-      <w:r>
-        <w:t xml:space="preserve">Argentina regula por la Ley 25.326; en Europa aplica el GDPR; existen estándares voluntarios (ISO/IEC 27701, privacy by design).</w:t>
-      </w:r>
-      <w:r>
-        <w:t xml:space="preserve"> </w:t>
-      </w:r>
-      <w:r>
-        <w:rPr>
-          <w:b/>
-          <w:bCs/>
-        </w:rPr>
-        <w:t xml:space="preserve">Lo que necesitamos de vos:</w:t>
-      </w:r>
-      <w:r>
-        <w:t xml:space="preserve"> </w:t>
-      </w:r>
-      <w:r>
-        <w:t xml:space="preserve">¿conviene un aviso genérico que se usara en todos los países, o versiones por jurisdicción? ¿Lanzaríamos con el aviso argentino y adaptar en el momento de expandirnos, o conviene diseñarlo multi-jurisdicción desde el inicio?</w:t>
-      </w:r>
-    </w:p>
-    <w:bookmarkEnd w:id="15"/>
-    <w:bookmarkEnd w:id="16"/>
-    <w:bookmarkStart w:id="17" w:name="X926f3557c14ea51c3a492209fc98f3fc02d7f96"/>
-    <w:p>
-      <w:pPr>
-        <w:pStyle w:val="Heading2"/>
-      </w:pPr>
-      <w:r>
-        <w:t xml:space="preserve">4 · Decisiones de producto que condicionan tus respuestas (para que las tengas presentes)</w:t>
+        <w:t xml:space="preserve">Qué esperamos de vos</w:t>
       </w:r>
     </w:p>
     <w:p>
@@ -790,7 +293,7 @@
         </w:numPr>
       </w:pPr>
       <w:r>
-        <w:t xml:space="preserve">¿El modelo local se ofrece</w:t>
+        <w:t xml:space="preserve">Respuesta a las</w:t>
       </w:r>
       <w:r>
         <w:t xml:space="preserve"> </w:t>
@@ -800,22 +303,13 @@
           <w:b/>
           <w:bCs/>
         </w:rPr>
-        <w:t xml:space="preserve">por defecto</w:t>
+        <w:t xml:space="preserve">P1–P5</w:t>
       </w:r>
       <w:r>
         <w:t xml:space="preserve"> </w:t>
       </w:r>
       <w:r>
-        <w:t xml:space="preserve">o solo como opción</w:t>
-      </w:r>
-      <w:r>
-        <w:t xml:space="preserve"> </w:t>
-      </w:r>
-      <w:r>
-        <w:t xml:space="preserve">“avanzada”</w:t>
-      </w:r>
-      <w:r>
-        <w:t xml:space="preserve">?</w:t>
+        <w:t xml:space="preserve">con norma citada.</w:t>
       </w:r>
     </w:p>
     <w:p>
@@ -827,23 +321,17 @@
         </w:numPr>
       </w:pPr>
       <w:r>
-        <w:t xml:space="preserve">¿El usuario podrá configurar</w:t>
-      </w:r>
-      <w:r>
-        <w:t xml:space="preserve"> </w:t>
-      </w:r>
-      <w:r>
         <w:rPr>
           <w:b/>
           <w:bCs/>
         </w:rPr>
-        <w:t xml:space="preserve">su propia API key</w:t>
+        <w:t xml:space="preserve">Veredicto</w:t>
       </w:r>
       <w:r>
         <w:t xml:space="preserve"> </w:t>
       </w:r>
       <w:r>
-        <w:t xml:space="preserve">(BYOK) y elegir proveedor? (Define quién es el responsable frente al titular de los datos del documento.)</w:t>
+        <w:t xml:space="preserve">sobre el Aviso v0.1: aprobás, aprobás con cambios, o nos pasás tu versión.</w:t>
       </w:r>
     </w:p>
     <w:p>
@@ -855,54 +343,17 @@
         </w:numPr>
       </w:pPr>
       <w:r>
-        <w:t xml:space="preserve">Para documentos con datos sensibles: ¿la plataforma debe</w:t>
-      </w:r>
-      <w:r>
-        <w:t xml:space="preserve"> </w:t>
-      </w:r>
-      <w:r>
-        <w:rPr>
-          <w:b/>
-          <w:bCs/>
-        </w:rPr>
-        <w:t xml:space="preserve">bloquear la subida</w:t>
-      </w:r>
-      <w:r>
-        <w:t xml:space="preserve"> </w:t>
-      </w:r>
-      <w:r>
-        <w:t xml:space="preserve">por defecto o solo</w:t>
-      </w:r>
-      <w:r>
-        <w:t xml:space="preserve"> </w:t>
-      </w:r>
-      <w:r>
-        <w:rPr>
-          <w:b/>
-          <w:bCs/>
-        </w:rPr>
-        <w:t xml:space="preserve">advertir</w:t>
-      </w:r>
-      <w:r>
-        <w:t xml:space="preserve">?</w:t>
-      </w:r>
-    </w:p>
-    <w:p>
-      <w:pPr>
-        <w:pStyle w:val="FirstParagraph"/>
-      </w:pPr>
-      <w:r>
-        <w:t xml:space="preserve">Estas tres son decisiones de producto, pero modifican el esquema legal aplicable, por eso te las listo acá.</w:t>
-      </w:r>
-    </w:p>
-    <w:bookmarkEnd w:id="17"/>
-    <w:bookmarkStart w:id="18" w:name="qué-esperamos-de-vos"/>
+        <w:t xml:space="preserve">Referencias (artículos/fallos) para dejar como evidencia en el ticket.</w:t>
+      </w:r>
+    </w:p>
+    <w:bookmarkEnd w:id="11"/>
+    <w:bookmarkStart w:id="12" w:name="adjuntos"/>
     <w:p>
       <w:pPr>
         <w:pStyle w:val="Heading2"/>
       </w:pPr>
       <w:r>
-        <w:t xml:space="preserve">5 · Qué esperamos de vos</w:t>
+        <w:t xml:space="preserve">Adjuntos</w:t>
       </w:r>
     </w:p>
     <w:p>
@@ -914,23 +365,16 @@
         </w:numPr>
       </w:pPr>
       <w:r>
-        <w:t xml:space="preserve">Respuesta a las</w:t>
+        <w:rPr>
+          <w:rStyle w:val="VerbatimChar"/>
+        </w:rPr>
+        <w:t xml:space="preserve">disclaimer-oficial-datos-sensibles-multiocr.pdf</w:t>
       </w:r>
       <w:r>
         <w:t xml:space="preserve"> </w:t>
       </w:r>
       <w:r>
-        <w:rPr>
-          <w:b/>
-          <w:bCs/>
-        </w:rPr>
-        <w:t xml:space="preserve">P1–P5</w:t>
-      </w:r>
-      <w:r>
-        <w:t xml:space="preserve"> </w:t>
-      </w:r>
-      <w:r>
-        <w:t xml:space="preserve">con fundamento (norma citada) cuando puedas.</w:t>
+        <w:t xml:space="preserve">— Aviso v0.1 (formato oficial).</w:t>
       </w:r>
     </w:p>
     <w:p>
@@ -943,16 +387,15 @@
       </w:pPr>
       <w:r>
         <w:rPr>
-          <w:b/>
-          <w:bCs/>
+          <w:rStyle w:val="VerbatimChar"/>
         </w:rPr>
-        <w:t xml:space="preserve">Veredicto sobre la redacción</w:t>
+        <w:t xml:space="preserve">disclaimer-oficial-datos-sensibles-multiocr.docx</w:t>
       </w:r>
       <w:r>
         <w:t xml:space="preserve"> </w:t>
       </w:r>
       <w:r>
-        <w:t xml:space="preserve">del Aviso v0.1 (adjunto): aprobás tal cual / con correcciones, o nos pasás una versión editada en el Word.</w:t>
+        <w:t xml:space="preserve">— misma versión editable.</w:t>
       </w:r>
     </w:p>
     <w:p>
@@ -964,70 +407,6 @@
         </w:numPr>
       </w:pPr>
       <w:r>
-        <w:t xml:space="preserve">Cualquier referencia (artículos, documentos, fallos) que sirva para dejar evidencia en el ticket ARG-597.</w:t>
-      </w:r>
-    </w:p>
-    <w:bookmarkEnd w:id="18"/>
-    <w:bookmarkStart w:id="19" w:name="adjuntos"/>
-    <w:p>
-      <w:pPr>
-        <w:pStyle w:val="Heading2"/>
-      </w:pPr>
-      <w:r>
-        <w:t xml:space="preserve">6 · Adjuntos</w:t>
-      </w:r>
-    </w:p>
-    <w:p>
-      <w:pPr>
-        <w:pStyle w:val="Compact"/>
-        <w:numPr>
-          <w:ilvl w:val="0"/>
-          <w:numId w:val="1004"/>
-        </w:numPr>
-      </w:pPr>
-      <w:r>
-        <w:rPr>
-          <w:rStyle w:val="VerbatimChar"/>
-        </w:rPr>
-        <w:t xml:space="preserve">disclaimer-oficial-datos-sensibles-multiocr.pdf</w:t>
-      </w:r>
-      <w:r>
-        <w:t xml:space="preserve"> </w:t>
-      </w:r>
-      <w:r>
-        <w:t xml:space="preserve">— Aviso de Privacidad y Tratamiento por IA (v0.1) en formato oficial.</w:t>
-      </w:r>
-    </w:p>
-    <w:p>
-      <w:pPr>
-        <w:pStyle w:val="Compact"/>
-        <w:numPr>
-          <w:ilvl w:val="0"/>
-          <w:numId w:val="1004"/>
-        </w:numPr>
-      </w:pPr>
-      <w:r>
-        <w:rPr>
-          <w:rStyle w:val="VerbatimChar"/>
-        </w:rPr>
-        <w:t xml:space="preserve">disclaimer-oficial-datos-sensibles-multiocr.docx</w:t>
-      </w:r>
-      <w:r>
-        <w:t xml:space="preserve"> </w:t>
-      </w:r>
-      <w:r>
-        <w:t xml:space="preserve">— misma versión editable en Word.</w:t>
-      </w:r>
-    </w:p>
-    <w:p>
-      <w:pPr>
-        <w:pStyle w:val="Compact"/>
-        <w:numPr>
-          <w:ilvl w:val="0"/>
-          <w:numId w:val="1004"/>
-        </w:numPr>
-      </w:pPr>
-      <w:r>
         <w:rPr>
           <w:rStyle w:val="VerbatimChar"/>
         </w:rPr>
@@ -1037,14 +416,7 @@
         <w:t xml:space="preserve"> </w:t>
       </w:r>
       <w:r>
-        <w:t xml:space="preserve">— evidencia investigada con fuentes (tabla de retención, clasificación legal, transferencia internacional, precedentes), por si querés profundizar.</w:t>
-      </w:r>
-    </w:p>
-    <w:p>
-      <w:r>
-        <w:pict>
-          <v:rect style="width:0;height:1.5pt" o:hralign="center" o:hrstd="t" o:hr="t"/>
-        </w:pict>
+        <w:t xml:space="preserve">— evidencia investigada con fuentes.</w:t>
       </w:r>
     </w:p>
     <w:p>
@@ -1052,7 +424,7 @@
         <w:pStyle w:val="FirstParagraph"/>
       </w:pPr>
       <w:r>
-        <w:t xml:space="preserve">Sin más, quedamos atentos. Gracias por el tiempo y la ayuda.</w:t>
+        <w:t xml:space="preserve">Gracias por el tiempo. Quedamos atentos.</w:t>
       </w:r>
     </w:p>
     <w:p>
@@ -1086,11 +458,11 @@
         <w:t xml:space="preserve"> </w:t>
       </w:r>
       <w:r>
-        <w:t xml:space="preserve">· [Tu email/telefono] — [Nombre de la empresa/organización]</w:t>
-      </w:r>
-    </w:p>
-    <w:bookmarkEnd w:id="19"/>
-    <w:bookmarkEnd w:id="20"/>
+        <w:t xml:space="preserve">· [contacto] — [empresa/organización]</w:t>
+      </w:r>
+    </w:p>
+    <w:bookmarkEnd w:id="12"/>
+    <w:bookmarkEnd w:id="13"/>
     <w:sectPr>
       <w:footnotePr>
         <w:numRestart w:val="eachSect"/>
@@ -1396,39 +768,9 @@
     <w:abstractNumId w:val="991"/>
   </w:num>
   <w:num w:numId="1002">
-    <w:abstractNumId w:val="99411"/>
-    <w:lvlOverride w:ilvl="0">
-      <w:startOverride w:val="1"/>
-    </w:lvlOverride>
-    <w:lvlOverride w:ilvl="1">
-      <w:startOverride w:val="1"/>
-    </w:lvlOverride>
-    <w:lvlOverride w:ilvl="2">
-      <w:startOverride w:val="1"/>
-    </w:lvlOverride>
-    <w:lvlOverride w:ilvl="3">
-      <w:startOverride w:val="1"/>
-    </w:lvlOverride>
-    <w:lvlOverride w:ilvl="4">
-      <w:startOverride w:val="1"/>
-    </w:lvlOverride>
-    <w:lvlOverride w:ilvl="5">
-      <w:startOverride w:val="1"/>
-    </w:lvlOverride>
-    <w:lvlOverride w:ilvl="6">
-      <w:startOverride w:val="1"/>
-    </w:lvlOverride>
-    <w:lvlOverride w:ilvl="7">
-      <w:startOverride w:val="1"/>
-    </w:lvlOverride>
-    <w:lvlOverride w:ilvl="8">
-      <w:startOverride w:val="1"/>
-    </w:lvlOverride>
+    <w:abstractNumId w:val="991"/>
   </w:num>
   <w:num w:numId="1003">
-    <w:abstractNumId w:val="991"/>
-  </w:num>
-  <w:num w:numId="1004">
     <w:abstractNumId w:val="99411"/>
     <w:lvlOverride w:ilvl="0">
       <w:startOverride w:val="1"/>

</xml_diff>